<commit_message>
Adding explanation for bonus
</commit_message>
<xml_diff>
--- a/T3_BCD_SEGS/T3 BCD.docx
+++ b/T3_BCD_SEGS/T3 BCD.docx
@@ -17,7 +17,55 @@
         <w:t>ADOLFO GARAY</w:t>
       </w:r>
     </w:p>
-    <w:p/>
+    <w:p>
+      <w:r>
+        <w:t>EXPLICACIÓN DOUBLE DABBLE</w:t>
+      </w:r>
+    </w:p>
+    <w:p>
+      <w:r>
+        <w:t xml:space="preserve">Se hace el </w:t>
+      </w:r>
+      <w:r>
+        <w:t>desplazamiento</w:t>
+      </w:r>
+      <w:r>
+        <w:t xml:space="preserve"> a la izquierda </w:t>
+      </w:r>
+      <w:r>
+        <w:t xml:space="preserve">la cantidad de bits del número </w:t>
+      </w:r>
+      <w:r>
+        <w:t>para</w:t>
+      </w:r>
+      <w:r>
+        <w:t xml:space="preserve"> </w:t>
+      </w:r>
+      <w:r>
+        <w:t xml:space="preserve">pasar </w:t>
+      </w:r>
+      <w:r>
+        <w:t>hasta el último</w:t>
+      </w:r>
+      <w:r>
+        <w:t xml:space="preserve"> bit a </w:t>
+      </w:r>
+      <w:r>
+        <w:t>los términos</w:t>
+      </w:r>
+      <w:r>
+        <w:t xml:space="preserve"> del BCD</w:t>
+      </w:r>
+      <w:r>
+        <w:t>, por ejemplo en un numero de 8 bits, para que la unidad 1 necesitas que se convierta en 256 para estar en el primer bit del primer término de BCD0, es decir, multiplicar 1 x2 8 veces</w:t>
+      </w:r>
+      <w:r>
+        <w:t>. Y para pasar la unidad no hay problema en ello porque va de</w:t>
+      </w:r>
+      <w:r>
+        <w:t xml:space="preserve"> 0 a 9, pero cuando entran las decenas y centenas se desajusta porque los cuatro bits que representan el digito están en binario y en realidad pueden representar del 0 al 15. Por ello se debe hacer el ajuste de sumar 3 previo al shift, esto provoca que se cubra esa diferencia de 6 (3x2=6).</w:t>
+      </w:r>
+    </w:p>
     <w:p>
       <w:r>
         <w:rPr>

</xml_diff>